<commit_message>
Docs: correct UX list-clearing guidance (delete action, not import option)
List imports have no 'clear target prior to import' option — that's a
module-import feature. Describe the real approach instead: a Delete from
list using selection action for UX_PAGE/UX_APP sequenced in the process
before the imports, and note a one-time clear suffices since the staging
views are cumulative.

Co-Authored-By: Claude Opus 4.8 <noreply@anthropic.com>
</commit_message>
<xml_diff>
--- a/docs/anaplan-model-setup-guide.docx
+++ b/docs/anaplan-model-setup-guide.docx
@@ -2904,37 +2904,13 @@
         <w:t xml:space="preserve"> </w:t>
       </w:r>
       <w:r>
-        <w:t xml:space="preserve">and containing only pages that were actually visited. Set the</w:t>
-      </w:r>
-      <w:r>
-        <w:t xml:space="preserve"> </w:t>
-      </w:r>
-      <w:r>
-        <w:rPr>
-          <w:rStyle w:val="VerbatimChar"/>
-        </w:rPr>
-        <w:t xml:space="preserve">UX_APP</w:t>
-      </w:r>
-      <w:r>
-        <w:t xml:space="preserve"> </w:t>
-      </w:r>
-      <w:r>
-        <w:t xml:space="preserve">/</w:t>
-      </w:r>
-      <w:r>
-        <w:t xml:space="preserve"> </w:t>
-      </w:r>
-      <w:r>
-        <w:rPr>
-          <w:rStyle w:val="VerbatimChar"/>
-        </w:rPr>
-        <w:t xml:space="preserve">UX_PAGE</w:t>
-      </w:r>
-      <w:r>
-        <w:t xml:space="preserve"> </w:t>
-      </w:r>
-      <w:r>
-        <w:t xml:space="preserve">imports to</w:t>
+        <w:t xml:space="preserve">and containing only pages that were actually visited. Think of them as</w:t>
+      </w:r>
+      <w:r>
+        <w:t xml:space="preserve"> </w:t>
+      </w:r>
+      <w:r>
+        <w:t xml:space="preserve">"who opened what, when." To drop stale members, note that</w:t>
       </w:r>
       <w:r>
         <w:t xml:space="preserve"> </w:t>
@@ -2944,19 +2920,179 @@
           <w:b/>
           <w:bCs/>
         </w:rPr>
-        <w:t xml:space="preserve">clear the list first</w:t>
-      </w:r>
-      <w:r>
-        <w:t xml:space="preserve"> </w:t>
-      </w:r>
-      <w:r>
-        <w:t xml:space="preserve">so no-longer-visited pages</w:t>
-      </w:r>
-      <w:r>
-        <w:t xml:space="preserve"> </w:t>
-      </w:r>
-      <w:r>
-        <w:t xml:space="preserve">don't accumulate as orphans. Think of them as "who opened what, when."</w:t>
+        <w:t xml:space="preserve">list imports</w:t>
+      </w:r>
+      <w:r>
+        <w:rPr>
+          <w:b/>
+          <w:bCs/>
+        </w:rPr>
+        <w:t xml:space="preserve"> </w:t>
+      </w:r>
+      <w:r>
+        <w:rPr>
+          <w:b/>
+          <w:bCs/>
+        </w:rPr>
+        <w:t xml:space="preserve">have no "clear target prior to import" option</w:t>
+      </w:r>
+      <w:r>
+        <w:t xml:space="preserve"> </w:t>
+      </w:r>
+      <w:r>
+        <w:t xml:space="preserve">— that's a module-import</w:t>
+      </w:r>
+      <w:r>
+        <w:t xml:space="preserve"> </w:t>
+      </w:r>
+      <w:r>
+        <w:t xml:space="preserve">feature. Instead add a</w:t>
+      </w:r>
+      <w:r>
+        <w:t xml:space="preserve"> </w:t>
+      </w:r>
+      <w:r>
+        <w:rPr>
+          <w:i/>
+          <w:iCs/>
+        </w:rPr>
+        <w:t xml:space="preserve">Delete from list using selection</w:t>
+      </w:r>
+      <w:r>
+        <w:t xml:space="preserve"> </w:t>
+      </w:r>
+      <w:r>
+        <w:t xml:space="preserve">action for</w:t>
+      </w:r>
+      <w:r>
+        <w:t xml:space="preserve"> </w:t>
+      </w:r>
+      <w:r>
+        <w:rPr>
+          <w:rStyle w:val="VerbatimChar"/>
+        </w:rPr>
+        <w:t xml:space="preserve">UX_PAGE</w:t>
+      </w:r>
+      <w:r>
+        <w:t xml:space="preserve"> </w:t>
+      </w:r>
+      <w:r>
+        <w:t xml:space="preserve">and</w:t>
+      </w:r>
+      <w:r>
+        <w:t xml:space="preserve"> </w:t>
+      </w:r>
+      <w:r>
+        <w:rPr>
+          <w:rStyle w:val="VerbatimChar"/>
+        </w:rPr>
+        <w:t xml:space="preserve">UX_APP</w:t>
+      </w:r>
+      <w:r>
+        <w:t xml:space="preserve"> </w:t>
+      </w:r>
+      <w:r>
+        <w:t xml:space="preserve">(each driven by a boolean set TRUE for all items in</w:t>
+      </w:r>
+      <w:r>
+        <w:t xml:space="preserve"> </w:t>
+      </w:r>
+      <w:r>
+        <w:t xml:space="preserve">a module dimensioned by the list) and sequence the process as: delete</w:t>
+      </w:r>
+      <w:r>
+        <w:t xml:space="preserve"> </w:t>
+      </w:r>
+      <w:r>
+        <w:rPr>
+          <w:rStyle w:val="VerbatimChar"/>
+        </w:rPr>
+        <w:t xml:space="preserve">UX_PAGE</w:t>
+      </w:r>
+      <w:r>
+        <w:t xml:space="preserve"> </w:t>
+      </w:r>
+      <w:r>
+        <w:t xml:space="preserve">→ delete</w:t>
+      </w:r>
+      <w:r>
+        <w:t xml:space="preserve"> </w:t>
+      </w:r>
+      <w:r>
+        <w:rPr>
+          <w:rStyle w:val="VerbatimChar"/>
+        </w:rPr>
+        <w:t xml:space="preserve">UX_APP</w:t>
+      </w:r>
+      <w:r>
+        <w:t xml:space="preserve"> </w:t>
+      </w:r>
+      <w:r>
+        <w:t xml:space="preserve">→ import</w:t>
+      </w:r>
+      <w:r>
+        <w:t xml:space="preserve"> </w:t>
+      </w:r>
+      <w:r>
+        <w:rPr>
+          <w:rStyle w:val="VerbatimChar"/>
+        </w:rPr>
+        <w:t xml:space="preserve">UX_APP</w:t>
+      </w:r>
+      <w:r>
+        <w:t xml:space="preserve"> </w:t>
+      </w:r>
+      <w:r>
+        <w:t xml:space="preserve">→ import</w:t>
+      </w:r>
+      <w:r>
+        <w:t xml:space="preserve"> </w:t>
+      </w:r>
+      <w:r>
+        <w:rPr>
+          <w:rStyle w:val="VerbatimChar"/>
+        </w:rPr>
+        <w:t xml:space="preserve">UX_PAGE</w:t>
+      </w:r>
+      <w:r>
+        <w:t xml:space="preserve"> </w:t>
+      </w:r>
+      <w:r>
+        <w:t xml:space="preserve">(children</w:t>
+      </w:r>
+      <w:r>
+        <w:t xml:space="preserve"> </w:t>
+      </w:r>
+      <w:r>
+        <w:t xml:space="preserve">before parents when deleting; parents before children when importing).</w:t>
+      </w:r>
+      <w:r>
+        <w:t xml:space="preserve"> </w:t>
+      </w:r>
+      <w:r>
+        <w:t xml:space="preserve">Because the staging views are cumulative, a</w:t>
+      </w:r>
+      <w:r>
+        <w:t xml:space="preserve"> </w:t>
+      </w:r>
+      <w:r>
+        <w:rPr>
+          <w:b/>
+          <w:bCs/>
+        </w:rPr>
+        <w:t xml:space="preserve">one-time</w:t>
+      </w:r>
+      <w:r>
+        <w:t xml:space="preserve"> </w:t>
+      </w:r>
+      <w:r>
+        <w:t xml:space="preserve">clear is usually</w:t>
+      </w:r>
+      <w:r>
+        <w:t xml:space="preserve"> </w:t>
+      </w:r>
+      <w:r>
+        <w:t xml:space="preserve">enough to purge pre-existing orphans; ongoing clearing is optional.</w:t>
       </w:r>
     </w:p>
     <w:p>

</xml_diff>

<commit_message>
Docs: correct UX list-clearing guidance (delete action, not import option) (#7)
List imports have no 'clear target prior to import' option — that's a
module-import feature. Describe the real approach instead: a Delete from
list using selection action for UX_PAGE/UX_APP sequenced in the process
before the imports, and note a one-time clear suffices since the staging
views are cumulative.

Co-authored-by: Jon Ferneau <jon.ferneau@gmail.com>
Co-authored-by: Claude Opus 4.8 <noreply@anthropic.com>
</commit_message>
<xml_diff>
--- a/docs/anaplan-model-setup-guide.docx
+++ b/docs/anaplan-model-setup-guide.docx
@@ -2904,37 +2904,13 @@
         <w:t xml:space="preserve"> </w:t>
       </w:r>
       <w:r>
-        <w:t xml:space="preserve">and containing only pages that were actually visited. Set the</w:t>
-      </w:r>
-      <w:r>
-        <w:t xml:space="preserve"> </w:t>
-      </w:r>
-      <w:r>
-        <w:rPr>
-          <w:rStyle w:val="VerbatimChar"/>
-        </w:rPr>
-        <w:t xml:space="preserve">UX_APP</w:t>
-      </w:r>
-      <w:r>
-        <w:t xml:space="preserve"> </w:t>
-      </w:r>
-      <w:r>
-        <w:t xml:space="preserve">/</w:t>
-      </w:r>
-      <w:r>
-        <w:t xml:space="preserve"> </w:t>
-      </w:r>
-      <w:r>
-        <w:rPr>
-          <w:rStyle w:val="VerbatimChar"/>
-        </w:rPr>
-        <w:t xml:space="preserve">UX_PAGE</w:t>
-      </w:r>
-      <w:r>
-        <w:t xml:space="preserve"> </w:t>
-      </w:r>
-      <w:r>
-        <w:t xml:space="preserve">imports to</w:t>
+        <w:t xml:space="preserve">and containing only pages that were actually visited. Think of them as</w:t>
+      </w:r>
+      <w:r>
+        <w:t xml:space="preserve"> </w:t>
+      </w:r>
+      <w:r>
+        <w:t xml:space="preserve">"who opened what, when." To drop stale members, note that</w:t>
       </w:r>
       <w:r>
         <w:t xml:space="preserve"> </w:t>
@@ -2944,19 +2920,179 @@
           <w:b/>
           <w:bCs/>
         </w:rPr>
-        <w:t xml:space="preserve">clear the list first</w:t>
-      </w:r>
-      <w:r>
-        <w:t xml:space="preserve"> </w:t>
-      </w:r>
-      <w:r>
-        <w:t xml:space="preserve">so no-longer-visited pages</w:t>
-      </w:r>
-      <w:r>
-        <w:t xml:space="preserve"> </w:t>
-      </w:r>
-      <w:r>
-        <w:t xml:space="preserve">don't accumulate as orphans. Think of them as "who opened what, when."</w:t>
+        <w:t xml:space="preserve">list imports</w:t>
+      </w:r>
+      <w:r>
+        <w:rPr>
+          <w:b/>
+          <w:bCs/>
+        </w:rPr>
+        <w:t xml:space="preserve"> </w:t>
+      </w:r>
+      <w:r>
+        <w:rPr>
+          <w:b/>
+          <w:bCs/>
+        </w:rPr>
+        <w:t xml:space="preserve">have no "clear target prior to import" option</w:t>
+      </w:r>
+      <w:r>
+        <w:t xml:space="preserve"> </w:t>
+      </w:r>
+      <w:r>
+        <w:t xml:space="preserve">— that's a module-import</w:t>
+      </w:r>
+      <w:r>
+        <w:t xml:space="preserve"> </w:t>
+      </w:r>
+      <w:r>
+        <w:t xml:space="preserve">feature. Instead add a</w:t>
+      </w:r>
+      <w:r>
+        <w:t xml:space="preserve"> </w:t>
+      </w:r>
+      <w:r>
+        <w:rPr>
+          <w:i/>
+          <w:iCs/>
+        </w:rPr>
+        <w:t xml:space="preserve">Delete from list using selection</w:t>
+      </w:r>
+      <w:r>
+        <w:t xml:space="preserve"> </w:t>
+      </w:r>
+      <w:r>
+        <w:t xml:space="preserve">action for</w:t>
+      </w:r>
+      <w:r>
+        <w:t xml:space="preserve"> </w:t>
+      </w:r>
+      <w:r>
+        <w:rPr>
+          <w:rStyle w:val="VerbatimChar"/>
+        </w:rPr>
+        <w:t xml:space="preserve">UX_PAGE</w:t>
+      </w:r>
+      <w:r>
+        <w:t xml:space="preserve"> </w:t>
+      </w:r>
+      <w:r>
+        <w:t xml:space="preserve">and</w:t>
+      </w:r>
+      <w:r>
+        <w:t xml:space="preserve"> </w:t>
+      </w:r>
+      <w:r>
+        <w:rPr>
+          <w:rStyle w:val="VerbatimChar"/>
+        </w:rPr>
+        <w:t xml:space="preserve">UX_APP</w:t>
+      </w:r>
+      <w:r>
+        <w:t xml:space="preserve"> </w:t>
+      </w:r>
+      <w:r>
+        <w:t xml:space="preserve">(each driven by a boolean set TRUE for all items in</w:t>
+      </w:r>
+      <w:r>
+        <w:t xml:space="preserve"> </w:t>
+      </w:r>
+      <w:r>
+        <w:t xml:space="preserve">a module dimensioned by the list) and sequence the process as: delete</w:t>
+      </w:r>
+      <w:r>
+        <w:t xml:space="preserve"> </w:t>
+      </w:r>
+      <w:r>
+        <w:rPr>
+          <w:rStyle w:val="VerbatimChar"/>
+        </w:rPr>
+        <w:t xml:space="preserve">UX_PAGE</w:t>
+      </w:r>
+      <w:r>
+        <w:t xml:space="preserve"> </w:t>
+      </w:r>
+      <w:r>
+        <w:t xml:space="preserve">→ delete</w:t>
+      </w:r>
+      <w:r>
+        <w:t xml:space="preserve"> </w:t>
+      </w:r>
+      <w:r>
+        <w:rPr>
+          <w:rStyle w:val="VerbatimChar"/>
+        </w:rPr>
+        <w:t xml:space="preserve">UX_APP</w:t>
+      </w:r>
+      <w:r>
+        <w:t xml:space="preserve"> </w:t>
+      </w:r>
+      <w:r>
+        <w:t xml:space="preserve">→ import</w:t>
+      </w:r>
+      <w:r>
+        <w:t xml:space="preserve"> </w:t>
+      </w:r>
+      <w:r>
+        <w:rPr>
+          <w:rStyle w:val="VerbatimChar"/>
+        </w:rPr>
+        <w:t xml:space="preserve">UX_APP</w:t>
+      </w:r>
+      <w:r>
+        <w:t xml:space="preserve"> </w:t>
+      </w:r>
+      <w:r>
+        <w:t xml:space="preserve">→ import</w:t>
+      </w:r>
+      <w:r>
+        <w:t xml:space="preserve"> </w:t>
+      </w:r>
+      <w:r>
+        <w:rPr>
+          <w:rStyle w:val="VerbatimChar"/>
+        </w:rPr>
+        <w:t xml:space="preserve">UX_PAGE</w:t>
+      </w:r>
+      <w:r>
+        <w:t xml:space="preserve"> </w:t>
+      </w:r>
+      <w:r>
+        <w:t xml:space="preserve">(children</w:t>
+      </w:r>
+      <w:r>
+        <w:t xml:space="preserve"> </w:t>
+      </w:r>
+      <w:r>
+        <w:t xml:space="preserve">before parents when deleting; parents before children when importing).</w:t>
+      </w:r>
+      <w:r>
+        <w:t xml:space="preserve"> </w:t>
+      </w:r>
+      <w:r>
+        <w:t xml:space="preserve">Because the staging views are cumulative, a</w:t>
+      </w:r>
+      <w:r>
+        <w:t xml:space="preserve"> </w:t>
+      </w:r>
+      <w:r>
+        <w:rPr>
+          <w:b/>
+          <w:bCs/>
+        </w:rPr>
+        <w:t xml:space="preserve">one-time</w:t>
+      </w:r>
+      <w:r>
+        <w:t xml:space="preserve"> </w:t>
+      </w:r>
+      <w:r>
+        <w:t xml:space="preserve">clear is usually</w:t>
+      </w:r>
+      <w:r>
+        <w:t xml:space="preserve"> </w:t>
+      </w:r>
+      <w:r>
+        <w:t xml:space="preserve">enough to purge pre-existing orphans; ongoing clearing is optional.</w:t>
       </w:r>
     </w:p>
     <w:p>

</xml_diff>

<commit_message>
Make UX list names unique the way Anaplan compares them; flag non-UTF-8 file sources
A colleague's UX_APP import failed on two counts:

- "Another row has already been processed with this key": app names that
  differ only by case or whitespace are distinct to DuckDB but the same to
  Anaplan, so the view didn't disambiguate them. Names are now trimmed,
  whitespace-collapsed (including NBSP) and capped at 60 characters, and
  collisions are judged case-insensitively after the cap. Same for pages.
- "Invalid name: ...Pâ¦ (Duplicate 1)": the names are exactly 60 characters
  ending in "…"; the model's file source reads the UTF-8 CSV as Latin-1, so
  "…" becomes three characters and the name 62. That is a model setting, so
  the run now logs file_source_not_utf8 for any configured file source the
  API reports as non-UTF-8, and the setup guide says to use UTF-8.

Co-Authored-By: Claude Opus 5.5 <noreply@anthropic.com>
</commit_message>
<xml_diff>
--- a/docs/anaplan-model-setup-guide.docx
+++ b/docs/anaplan-model-setup-guide.docx
@@ -1231,6 +1231,82 @@
         <w:t xml:space="preserve">Process / Role / Target-User lists.</w:t>
       </w:r>
     </w:p>
+    <w:p>
+      <w:pPr>
+        <w:pStyle w:val="BlockText"/>
+      </w:pPr>
+      <w:r>
+        <w:rPr>
+          <w:b/>
+          <w:bCs/>
+        </w:rPr>
+        <w:t xml:space="preserve">Set every file source to UTF-8.</w:t>
+      </w:r>
+      <w:r>
+        <w:t xml:space="preserve"> </w:t>
+      </w:r>
+      <w:r>
+        <w:t xml:space="preserve">The tool writes UTF-8. A source</w:t>
+      </w:r>
+      <w:r>
+        <w:t xml:space="preserve"> </w:t>
+      </w:r>
+      <w:r>
+        <w:t xml:space="preserve">whose import data source settings use another encoding (for example</w:t>
+      </w:r>
+      <w:r>
+        <w:t xml:space="preserve"> </w:t>
+      </w:r>
+      <w:r>
+        <w:t xml:space="preserve">ISO-8859-1) mangles non-ASCII text. App names that Anaplan shortened</w:t>
+      </w:r>
+      <w:r>
+        <w:t xml:space="preserve"> </w:t>
+      </w:r>
+      <w:r>
+        <w:t xml:space="preserve">with "…" arrive as "â¦", which pushes a 60-character name past the</w:t>
+      </w:r>
+      <w:r>
+        <w:t xml:space="preserve"> </w:t>
+      </w:r>
+      <w:r>
+        <w:t xml:space="preserve">list-name limit and fails as</w:t>
+      </w:r>
+      <w:r>
+        <w:t xml:space="preserve"> </w:t>
+      </w:r>
+      <w:r>
+        <w:rPr>
+          <w:i/>
+          <w:iCs/>
+        </w:rPr>
+        <w:t xml:space="preserve">Invalid name</w:t>
+      </w:r>
+      <w:r>
+        <w:t xml:space="preserve">. When the API reports a</w:t>
+      </w:r>
+      <w:r>
+        <w:t xml:space="preserve"> </w:t>
+      </w:r>
+      <w:r>
+        <w:t xml:space="preserve">source's encoding, the run logs</w:t>
+      </w:r>
+      <w:r>
+        <w:t xml:space="preserve"> </w:t>
+      </w:r>
+      <w:r>
+        <w:rPr>
+          <w:rStyle w:val="VerbatimChar"/>
+        </w:rPr>
+        <w:t xml:space="preserve">file_source_not_utf8</w:t>
+      </w:r>
+      <w:r>
+        <w:t xml:space="preserve"> </w:t>
+      </w:r>
+      <w:r>
+        <w:t xml:space="preserve">for it.</w:t>
+      </w:r>
+    </w:p>
     <w:bookmarkEnd w:id="14"/>
     <w:bookmarkStart w:id="15" w:name="Xd21d8df81f2281b4b54485891f03baa8267f75f"/>
     <w:p>
@@ -2854,7 +2930,28 @@
         <w:t xml:space="preserve"> </w:t>
       </w:r>
       <w:r>
-        <w:t xml:space="preserve">share a page title.</w:t>
+        <w:t xml:space="preserve">share a page title. Names are compared the way Anaplan compares them</w:t>
+      </w:r>
+      <w:r>
+        <w:t xml:space="preserve"> </w:t>
+      </w:r>
+      <w:r>
+        <w:t xml:space="preserve">(ignoring case and extra spaces) and capped at 60 characters; apps that</w:t>
+      </w:r>
+      <w:r>
+        <w:t xml:space="preserve"> </w:t>
+      </w:r>
+      <w:r>
+        <w:t xml:space="preserve">still share a name get a short ID tag (</w:t>
+      </w:r>
+      <w:r>
+        <w:rPr>
+          <w:rStyle w:val="VerbatimChar"/>
+        </w:rPr>
+        <w:t xml:space="preserve">Sales App [1a2b3c4d]</w:t>
+      </w:r>
+      <w:r>
+        <w:t xml:space="preserve">).</w:t>
       </w:r>
       <w:r>
         <w:t xml:space="preserve"> </w:t>

</xml_diff>

<commit_message>
Make UX list names unique the way Anaplan compares them; flag non-UTF-8 file sources (#12)
A colleague's UX_APP import failed on two counts:

- "Another row has already been processed with this key": app names that
  differ only by case or whitespace are distinct to DuckDB but the same to
  Anaplan, so the view didn't disambiguate them. Names are now trimmed,
  whitespace-collapsed (including NBSP) and capped at 60 characters, and
  collisions are judged case-insensitively after the cap. Same for pages.
- "Invalid name: ...Pâ¦ (Duplicate 1)": the names are exactly 60 characters
  ending in "…"; the model's file source reads the UTF-8 CSV as Latin-1, so
  "…" becomes three characters and the name 62. That is a model setting, so
  the run now logs file_source_not_utf8 for any configured file source the
  API reports as non-UTF-8, and the setup guide says to use UTF-8.

Co-authored-by: Jon Ferneau <jon.ferneau@gmail.com>
Co-authored-by: Claude Opus 5.5 <noreply@anthropic.com>
</commit_message>
<xml_diff>
--- a/docs/anaplan-model-setup-guide.docx
+++ b/docs/anaplan-model-setup-guide.docx
@@ -1231,6 +1231,82 @@
         <w:t xml:space="preserve">Process / Role / Target-User lists.</w:t>
       </w:r>
     </w:p>
+    <w:p>
+      <w:pPr>
+        <w:pStyle w:val="BlockText"/>
+      </w:pPr>
+      <w:r>
+        <w:rPr>
+          <w:b/>
+          <w:bCs/>
+        </w:rPr>
+        <w:t xml:space="preserve">Set every file source to UTF-8.</w:t>
+      </w:r>
+      <w:r>
+        <w:t xml:space="preserve"> </w:t>
+      </w:r>
+      <w:r>
+        <w:t xml:space="preserve">The tool writes UTF-8. A source</w:t>
+      </w:r>
+      <w:r>
+        <w:t xml:space="preserve"> </w:t>
+      </w:r>
+      <w:r>
+        <w:t xml:space="preserve">whose import data source settings use another encoding (for example</w:t>
+      </w:r>
+      <w:r>
+        <w:t xml:space="preserve"> </w:t>
+      </w:r>
+      <w:r>
+        <w:t xml:space="preserve">ISO-8859-1) mangles non-ASCII text. App names that Anaplan shortened</w:t>
+      </w:r>
+      <w:r>
+        <w:t xml:space="preserve"> </w:t>
+      </w:r>
+      <w:r>
+        <w:t xml:space="preserve">with "…" arrive as "â¦", which pushes a 60-character name past the</w:t>
+      </w:r>
+      <w:r>
+        <w:t xml:space="preserve"> </w:t>
+      </w:r>
+      <w:r>
+        <w:t xml:space="preserve">list-name limit and fails as</w:t>
+      </w:r>
+      <w:r>
+        <w:t xml:space="preserve"> </w:t>
+      </w:r>
+      <w:r>
+        <w:rPr>
+          <w:i/>
+          <w:iCs/>
+        </w:rPr>
+        <w:t xml:space="preserve">Invalid name</w:t>
+      </w:r>
+      <w:r>
+        <w:t xml:space="preserve">. When the API reports a</w:t>
+      </w:r>
+      <w:r>
+        <w:t xml:space="preserve"> </w:t>
+      </w:r>
+      <w:r>
+        <w:t xml:space="preserve">source's encoding, the run logs</w:t>
+      </w:r>
+      <w:r>
+        <w:t xml:space="preserve"> </w:t>
+      </w:r>
+      <w:r>
+        <w:rPr>
+          <w:rStyle w:val="VerbatimChar"/>
+        </w:rPr>
+        <w:t xml:space="preserve">file_source_not_utf8</w:t>
+      </w:r>
+      <w:r>
+        <w:t xml:space="preserve"> </w:t>
+      </w:r>
+      <w:r>
+        <w:t xml:space="preserve">for it.</w:t>
+      </w:r>
+    </w:p>
     <w:bookmarkEnd w:id="14"/>
     <w:bookmarkStart w:id="15" w:name="Xd21d8df81f2281b4b54485891f03baa8267f75f"/>
     <w:p>
@@ -2854,7 +2930,28 @@
         <w:t xml:space="preserve"> </w:t>
       </w:r>
       <w:r>
-        <w:t xml:space="preserve">share a page title.</w:t>
+        <w:t xml:space="preserve">share a page title. Names are compared the way Anaplan compares them</w:t>
+      </w:r>
+      <w:r>
+        <w:t xml:space="preserve"> </w:t>
+      </w:r>
+      <w:r>
+        <w:t xml:space="preserve">(ignoring case and extra spaces) and capped at 60 characters; apps that</w:t>
+      </w:r>
+      <w:r>
+        <w:t xml:space="preserve"> </w:t>
+      </w:r>
+      <w:r>
+        <w:t xml:space="preserve">still share a name get a short ID tag (</w:t>
+      </w:r>
+      <w:r>
+        <w:rPr>
+          <w:rStyle w:val="VerbatimChar"/>
+        </w:rPr>
+        <w:t xml:space="preserve">Sales App [1a2b3c4d]</w:t>
+      </w:r>
+      <w:r>
+        <w:t xml:space="preserve">).</w:t>
       </w:r>
       <w:r>
         <w:t xml:space="preserve"> </w:t>

</xml_diff>

<commit_message>
Ship Model History vocabulary lists in examples/
Add examples/MH_OBJECT_TYPES.csv and examples/MH_CHANGE_TYPES.csv so model
builders can pre-load the list-formatted change_type/object_type lists, with
a test that keeps them identical to the bundled vocabularies. Document where
the classification rules live.

Co-Authored-By: Claude Opus 5.5 <noreply@anthropic.com>
</commit_message>
<xml_diff>
--- a/docs/anaplan-model-setup-guide.docx
+++ b/docs/anaplan-model-setup-guide.docx
@@ -3773,7 +3773,7 @@
     </w:p>
     <w:bookmarkEnd w:id="18"/>
     <w:bookmarkEnd w:id="19"/>
-    <w:bookmarkStart w:id="23" w:name="X03979929a4fc2fc757c9e3a8573aabc086f2ef8"/>
+    <w:bookmarkStart w:id="26" w:name="X03979929a4fc2fc757c9e3a8573aabc086f2ef8"/>
     <w:p>
       <w:pPr>
         <w:pStyle w:val="Heading1"/>
@@ -4032,7 +4032,7 @@
       </w:tr>
     </w:tbl>
     <w:bookmarkEnd w:id="20"/>
-    <w:bookmarkStart w:id="21" w:name="X94fd6e99d3aee2e974eb5e7b8528011c6320808"/>
+    <w:bookmarkStart w:id="24" w:name="X94fd6e99d3aee2e974eb5e7b8528011c6320808"/>
     <w:p>
       <w:pPr>
         <w:pStyle w:val="Heading2"/>
@@ -4509,11 +4509,148 @@
         <w:t xml:space="preserve"> </w:t>
       </w:r>
       <w:r>
-        <w:t xml:space="preserve">pivot and filter cleanly.</w:t>
-      </w:r>
-    </w:p>
-    <w:bookmarkEnd w:id="21"/>
-    <w:bookmarkStart w:id="22" w:name="X0346808853699627d35f8decfbfe66d34c60040"/>
+        <w:t xml:space="preserve">pivot and filter cleanly. To do that, create an</w:t>
+      </w:r>
+      <w:r>
+        <w:t xml:space="preserve"> </w:t>
+      </w:r>
+      <w:r>
+        <w:rPr>
+          <w:rStyle w:val="VerbatimChar"/>
+        </w:rPr>
+        <w:t xml:space="preserve">MH_CHANGE_TYPES</w:t>
+      </w:r>
+      <w:r>
+        <w:t xml:space="preserve"> </w:t>
+      </w:r>
+      <w:r>
+        <w:t xml:space="preserve">and an</w:t>
+      </w:r>
+      <w:r>
+        <w:t xml:space="preserve"> </w:t>
+      </w:r>
+      <w:r>
+        <w:rPr>
+          <w:rStyle w:val="VerbatimChar"/>
+        </w:rPr>
+        <w:t xml:space="preserve">MH_OBJECT_TYPES</w:t>
+      </w:r>
+      <w:r>
+        <w:t xml:space="preserve"> </w:t>
+      </w:r>
+      <w:r>
+        <w:t xml:space="preserve">list and load them once from</w:t>
+      </w:r>
+      <w:r>
+        <w:t xml:space="preserve"> </w:t>
+      </w:r>
+      <w:hyperlink r:id="rId21">
+        <w:r>
+          <w:rPr>
+            <w:rStyle w:val="VerbatimChar"/>
+          </w:rPr>
+          <w:t xml:space="preserve">examples/MH_CHANGE_TYPES.csv</w:t>
+        </w:r>
+      </w:hyperlink>
+      <w:r>
+        <w:t xml:space="preserve"> </w:t>
+      </w:r>
+      <w:r>
+        <w:t xml:space="preserve">and</w:t>
+      </w:r>
+      <w:r>
+        <w:t xml:space="preserve"> </w:t>
+      </w:r>
+      <w:hyperlink r:id="rId22">
+        <w:r>
+          <w:rPr>
+            <w:rStyle w:val="VerbatimChar"/>
+          </w:rPr>
+          <w:t xml:space="preserve">examples/MH_OBJECT_TYPES.csv</w:t>
+        </w:r>
+      </w:hyperlink>
+      <w:r>
+        <w:t xml:space="preserve"> </w:t>
+      </w:r>
+      <w:r>
+        <w:t xml:space="preserve">(one</w:t>
+      </w:r>
+      <w:r>
+        <w:t xml:space="preserve"> </w:t>
+      </w:r>
+      <w:r>
+        <w:t xml:space="preserve">column; map it to Name). These are the complete sets of values the tool can</w:t>
+      </w:r>
+      <w:r>
+        <w:t xml:space="preserve"> </w:t>
+      </w:r>
+      <w:r>
+        <w:t xml:space="preserve">emit, so every detail row matches a list item.</w:t>
+      </w:r>
+    </w:p>
+    <w:p>
+      <w:pPr>
+        <w:pStyle w:val="BodyText"/>
+      </w:pPr>
+      <w:r>
+        <w:t xml:space="preserve">The rules that map a description to these values live in the tool, in</w:t>
+      </w:r>
+      <w:r>
+        <w:t xml:space="preserve"> </w:t>
+      </w:r>
+      <w:hyperlink r:id="rId23">
+        <w:r>
+          <w:rPr>
+            <w:rStyle w:val="VerbatimChar"/>
+          </w:rPr>
+          <w:t xml:space="preserve">mh_classification_rules.csv</w:t>
+        </w:r>
+      </w:hyperlink>
+      <w:r>
+        <w:t xml:space="preserve"> </w:t>
+      </w:r>
+      <w:r>
+        <w:t xml:space="preserve">(read top-down by</w:t>
+      </w:r>
+      <w:r>
+        <w:t xml:space="preserve"> </w:t>
+      </w:r>
+      <w:r>
+        <w:rPr>
+          <w:rStyle w:val="VerbatimChar"/>
+        </w:rPr>
+        <w:t xml:space="preserve">priority</w:t>
+      </w:r>
+      <w:r>
+        <w:t xml:space="preserve">; first match wins, anything unmatched becomes</w:t>
+      </w:r>
+      <w:r>
+        <w:t xml:space="preserve"> </w:t>
+      </w:r>
+      <w:r>
+        <w:rPr>
+          <w:rStyle w:val="VerbatimChar"/>
+        </w:rPr>
+        <w:t xml:space="preserve">Other</w:t>
+      </w:r>
+      <w:r>
+        <w:t xml:space="preserve">). They are not loaded into Anaplan. If a release adds a value to</w:t>
+      </w:r>
+      <w:r>
+        <w:t xml:space="preserve"> </w:t>
+      </w:r>
+      <w:r>
+        <w:t xml:space="preserve">either vocabulary, add the same item to the matching list before that</w:t>
+      </w:r>
+      <w:r>
+        <w:t xml:space="preserve"> </w:t>
+      </w:r>
+      <w:r>
+        <w:t xml:space="preserve">release's first run.</w:t>
+      </w:r>
+    </w:p>
+    <w:bookmarkEnd w:id="24"/>
+    <w:bookmarkStart w:id="25" w:name="X0346808853699627d35f8decfbfe66d34c60040"/>
     <w:p>
       <w:pPr>
         <w:pStyle w:val="Heading2"/>
@@ -4736,9 +4873,9 @@
         </w:pict>
       </w:r>
     </w:p>
-    <w:bookmarkEnd w:id="22"/>
-    <w:bookmarkEnd w:id="23"/>
-    <w:bookmarkStart w:id="28" w:name="X80e4cecf45cc3161e5ac345cb559ba902529ded"/>
+    <w:bookmarkEnd w:id="25"/>
+    <w:bookmarkEnd w:id="26"/>
+    <w:bookmarkStart w:id="31" w:name="X80e4cecf45cc3161e5ac345cb559ba902529ded"/>
     <w:p>
       <w:pPr>
         <w:pStyle w:val="Heading1"/>
@@ -4883,7 +5020,7 @@
         <w:t xml:space="preserve">See the Operations Runbook, Section 3.</w:t>
       </w:r>
     </w:p>
-    <w:bookmarkStart w:id="24" w:name="X0494fa3082f551772fcb735cbd4ad7ca1ebdac3"/>
+    <w:bookmarkStart w:id="27" w:name="X0494fa3082f551772fcb735cbd4ad7ca1ebdac3"/>
     <w:p>
       <w:pPr>
         <w:pStyle w:val="Heading2"/>
@@ -5029,8 +5166,8 @@
         <w:t xml:space="preserve"># 231</w:t>
       </w:r>
     </w:p>
-    <w:bookmarkEnd w:id="24"/>
-    <w:bookmarkStart w:id="25" w:name="X52b9deeec8c1a8f62fd4137ca347bddcb438bbc"/>
+    <w:bookmarkEnd w:id="27"/>
+    <w:bookmarkStart w:id="28" w:name="X52b9deeec8c1a8f62fd4137ca347bddcb438bbc"/>
     <w:p>
       <w:pPr>
         <w:pStyle w:val="Heading2"/>
@@ -5099,8 +5236,8 @@
         </w:pict>
       </w:r>
     </w:p>
-    <w:bookmarkEnd w:id="25"/>
-    <w:bookmarkStart w:id="27" w:name="document-control"/>
+    <w:bookmarkEnd w:id="28"/>
+    <w:bookmarkStart w:id="30" w:name="document-control"/>
     <w:p>
       <w:pPr>
         <w:pStyle w:val="Heading2"/>
@@ -5193,7 +5330,7 @@
       <w:r>
         <w:t xml:space="preserve"> </w:t>
       </w:r>
-      <w:hyperlink r:id="rId26">
+      <w:hyperlink r:id="rId29">
         <w:r>
           <w:rPr>
             <w:rStyle w:val="Hyperlink"/>
@@ -5202,8 +5339,8 @@
         </w:r>
       </w:hyperlink>
     </w:p>
-    <w:bookmarkEnd w:id="27"/>
-    <w:bookmarkEnd w:id="28"/>
+    <w:bookmarkEnd w:id="30"/>
+    <w:bookmarkEnd w:id="31"/>
     <w:sectPr>
       <w:footnotePr>
         <w:numRestart w:val="eachSect"/>

</xml_diff>

<commit_message>
Ship Model History vocabulary lists in examples/ (#14)
Add examples/MH_OBJECT_TYPES.csv and examples/MH_CHANGE_TYPES.csv so model
builders can pre-load the list-formatted change_type/object_type lists, with
a test that keeps them identical to the bundled vocabularies. Document where
the classification rules live.

Co-authored-by: Jon Ferneau <jon.ferneau@gmail.com>
Co-authored-by: Claude Opus 5.5 <noreply@anthropic.com>
</commit_message>
<xml_diff>
--- a/docs/anaplan-model-setup-guide.docx
+++ b/docs/anaplan-model-setup-guide.docx
@@ -3773,7 +3773,7 @@
     </w:p>
     <w:bookmarkEnd w:id="18"/>
     <w:bookmarkEnd w:id="19"/>
-    <w:bookmarkStart w:id="23" w:name="X03979929a4fc2fc757c9e3a8573aabc086f2ef8"/>
+    <w:bookmarkStart w:id="26" w:name="X03979929a4fc2fc757c9e3a8573aabc086f2ef8"/>
     <w:p>
       <w:pPr>
         <w:pStyle w:val="Heading1"/>
@@ -4032,7 +4032,7 @@
       </w:tr>
     </w:tbl>
     <w:bookmarkEnd w:id="20"/>
-    <w:bookmarkStart w:id="21" w:name="X94fd6e99d3aee2e974eb5e7b8528011c6320808"/>
+    <w:bookmarkStart w:id="24" w:name="X94fd6e99d3aee2e974eb5e7b8528011c6320808"/>
     <w:p>
       <w:pPr>
         <w:pStyle w:val="Heading2"/>
@@ -4509,11 +4509,148 @@
         <w:t xml:space="preserve"> </w:t>
       </w:r>
       <w:r>
-        <w:t xml:space="preserve">pivot and filter cleanly.</w:t>
-      </w:r>
-    </w:p>
-    <w:bookmarkEnd w:id="21"/>
-    <w:bookmarkStart w:id="22" w:name="X0346808853699627d35f8decfbfe66d34c60040"/>
+        <w:t xml:space="preserve">pivot and filter cleanly. To do that, create an</w:t>
+      </w:r>
+      <w:r>
+        <w:t xml:space="preserve"> </w:t>
+      </w:r>
+      <w:r>
+        <w:rPr>
+          <w:rStyle w:val="VerbatimChar"/>
+        </w:rPr>
+        <w:t xml:space="preserve">MH_CHANGE_TYPES</w:t>
+      </w:r>
+      <w:r>
+        <w:t xml:space="preserve"> </w:t>
+      </w:r>
+      <w:r>
+        <w:t xml:space="preserve">and an</w:t>
+      </w:r>
+      <w:r>
+        <w:t xml:space="preserve"> </w:t>
+      </w:r>
+      <w:r>
+        <w:rPr>
+          <w:rStyle w:val="VerbatimChar"/>
+        </w:rPr>
+        <w:t xml:space="preserve">MH_OBJECT_TYPES</w:t>
+      </w:r>
+      <w:r>
+        <w:t xml:space="preserve"> </w:t>
+      </w:r>
+      <w:r>
+        <w:t xml:space="preserve">list and load them once from</w:t>
+      </w:r>
+      <w:r>
+        <w:t xml:space="preserve"> </w:t>
+      </w:r>
+      <w:hyperlink r:id="rId21">
+        <w:r>
+          <w:rPr>
+            <w:rStyle w:val="VerbatimChar"/>
+          </w:rPr>
+          <w:t xml:space="preserve">examples/MH_CHANGE_TYPES.csv</w:t>
+        </w:r>
+      </w:hyperlink>
+      <w:r>
+        <w:t xml:space="preserve"> </w:t>
+      </w:r>
+      <w:r>
+        <w:t xml:space="preserve">and</w:t>
+      </w:r>
+      <w:r>
+        <w:t xml:space="preserve"> </w:t>
+      </w:r>
+      <w:hyperlink r:id="rId22">
+        <w:r>
+          <w:rPr>
+            <w:rStyle w:val="VerbatimChar"/>
+          </w:rPr>
+          <w:t xml:space="preserve">examples/MH_OBJECT_TYPES.csv</w:t>
+        </w:r>
+      </w:hyperlink>
+      <w:r>
+        <w:t xml:space="preserve"> </w:t>
+      </w:r>
+      <w:r>
+        <w:t xml:space="preserve">(one</w:t>
+      </w:r>
+      <w:r>
+        <w:t xml:space="preserve"> </w:t>
+      </w:r>
+      <w:r>
+        <w:t xml:space="preserve">column; map it to Name). These are the complete sets of values the tool can</w:t>
+      </w:r>
+      <w:r>
+        <w:t xml:space="preserve"> </w:t>
+      </w:r>
+      <w:r>
+        <w:t xml:space="preserve">emit, so every detail row matches a list item.</w:t>
+      </w:r>
+    </w:p>
+    <w:p>
+      <w:pPr>
+        <w:pStyle w:val="BodyText"/>
+      </w:pPr>
+      <w:r>
+        <w:t xml:space="preserve">The rules that map a description to these values live in the tool, in</w:t>
+      </w:r>
+      <w:r>
+        <w:t xml:space="preserve"> </w:t>
+      </w:r>
+      <w:hyperlink r:id="rId23">
+        <w:r>
+          <w:rPr>
+            <w:rStyle w:val="VerbatimChar"/>
+          </w:rPr>
+          <w:t xml:space="preserve">mh_classification_rules.csv</w:t>
+        </w:r>
+      </w:hyperlink>
+      <w:r>
+        <w:t xml:space="preserve"> </w:t>
+      </w:r>
+      <w:r>
+        <w:t xml:space="preserve">(read top-down by</w:t>
+      </w:r>
+      <w:r>
+        <w:t xml:space="preserve"> </w:t>
+      </w:r>
+      <w:r>
+        <w:rPr>
+          <w:rStyle w:val="VerbatimChar"/>
+        </w:rPr>
+        <w:t xml:space="preserve">priority</w:t>
+      </w:r>
+      <w:r>
+        <w:t xml:space="preserve">; first match wins, anything unmatched becomes</w:t>
+      </w:r>
+      <w:r>
+        <w:t xml:space="preserve"> </w:t>
+      </w:r>
+      <w:r>
+        <w:rPr>
+          <w:rStyle w:val="VerbatimChar"/>
+        </w:rPr>
+        <w:t xml:space="preserve">Other</w:t>
+      </w:r>
+      <w:r>
+        <w:t xml:space="preserve">). They are not loaded into Anaplan. If a release adds a value to</w:t>
+      </w:r>
+      <w:r>
+        <w:t xml:space="preserve"> </w:t>
+      </w:r>
+      <w:r>
+        <w:t xml:space="preserve">either vocabulary, add the same item to the matching list before that</w:t>
+      </w:r>
+      <w:r>
+        <w:t xml:space="preserve"> </w:t>
+      </w:r>
+      <w:r>
+        <w:t xml:space="preserve">release's first run.</w:t>
+      </w:r>
+    </w:p>
+    <w:bookmarkEnd w:id="24"/>
+    <w:bookmarkStart w:id="25" w:name="X0346808853699627d35f8decfbfe66d34c60040"/>
     <w:p>
       <w:pPr>
         <w:pStyle w:val="Heading2"/>
@@ -4736,9 +4873,9 @@
         </w:pict>
       </w:r>
     </w:p>
-    <w:bookmarkEnd w:id="22"/>
-    <w:bookmarkEnd w:id="23"/>
-    <w:bookmarkStart w:id="28" w:name="X80e4cecf45cc3161e5ac345cb559ba902529ded"/>
+    <w:bookmarkEnd w:id="25"/>
+    <w:bookmarkEnd w:id="26"/>
+    <w:bookmarkStart w:id="31" w:name="X80e4cecf45cc3161e5ac345cb559ba902529ded"/>
     <w:p>
       <w:pPr>
         <w:pStyle w:val="Heading1"/>
@@ -4883,7 +5020,7 @@
         <w:t xml:space="preserve">See the Operations Runbook, Section 3.</w:t>
       </w:r>
     </w:p>
-    <w:bookmarkStart w:id="24" w:name="X0494fa3082f551772fcb735cbd4ad7ca1ebdac3"/>
+    <w:bookmarkStart w:id="27" w:name="X0494fa3082f551772fcb735cbd4ad7ca1ebdac3"/>
     <w:p>
       <w:pPr>
         <w:pStyle w:val="Heading2"/>
@@ -5029,8 +5166,8 @@
         <w:t xml:space="preserve"># 231</w:t>
       </w:r>
     </w:p>
-    <w:bookmarkEnd w:id="24"/>
-    <w:bookmarkStart w:id="25" w:name="X52b9deeec8c1a8f62fd4137ca347bddcb438bbc"/>
+    <w:bookmarkEnd w:id="27"/>
+    <w:bookmarkStart w:id="28" w:name="X52b9deeec8c1a8f62fd4137ca347bddcb438bbc"/>
     <w:p>
       <w:pPr>
         <w:pStyle w:val="Heading2"/>
@@ -5099,8 +5236,8 @@
         </w:pict>
       </w:r>
     </w:p>
-    <w:bookmarkEnd w:id="25"/>
-    <w:bookmarkStart w:id="27" w:name="document-control"/>
+    <w:bookmarkEnd w:id="28"/>
+    <w:bookmarkStart w:id="30" w:name="document-control"/>
     <w:p>
       <w:pPr>
         <w:pStyle w:val="Heading2"/>
@@ -5193,7 +5330,7 @@
       <w:r>
         <w:t xml:space="preserve"> </w:t>
       </w:r>
-      <w:hyperlink r:id="rId26">
+      <w:hyperlink r:id="rId29">
         <w:r>
           <w:rPr>
             <w:rStyle w:val="Hyperlink"/>
@@ -5202,8 +5339,8 @@
         </w:r>
       </w:hyperlink>
     </w:p>
-    <w:bookmarkEnd w:id="27"/>
-    <w:bookmarkEnd w:id="28"/>
+    <w:bookmarkEnd w:id="30"/>
+    <w:bookmarkEnd w:id="31"/>
     <w:sectPr>
       <w:footnotePr>
         <w:numRestart w:val="eachSect"/>

</xml_diff>

<commit_message>
Model History: capture Anaplan's new Method column (AI-assisted changes)
Anaplan's model history export now carries a Method column ("AI-Assisted"
or blank). It was being logged as unmapped and dropped. Map it to a new
method column on model_history_normalized and MODEL_HISTORY_NORMALIZED.csv,
appended last so existing column-number mappings keep working.

Existing databases gain the column via the usual ADD COLUMN migration.
On re-ingest, method backfills rows stored earlier but is never
overwritten with a blank, since an export may omit the column. record_id
does not include method, so dedup keys are unchanged.

Co-Authored-By: Claude Opus 5.5 <noreply@anthropic.com>
</commit_message>
<xml_diff>
--- a/docs/anaplan-model-setup-guide.docx
+++ b/docs/anaplan-model-setup-guide.docx
@@ -4448,6 +4448,52 @@
               <w:pStyle w:val="Compact"/>
             </w:pPr>
             <w:r>
+              <w:t xml:space="preserve">method</w:t>
+            </w:r>
+          </w:p>
+        </w:tc>
+        <w:tc>
+          <w:tcPr/>
+          <w:p>
+            <w:pPr>
+              <w:pStyle w:val="Compact"/>
+            </w:pPr>
+            <w:r>
+              <w:rPr>
+                <w:rStyle w:val="VerbatimChar"/>
+              </w:rPr>
+              <w:t xml:space="preserve">method</w:t>
+            </w:r>
+            <w:r>
+              <w:t xml:space="preserve"> </w:t>
+            </w:r>
+            <w:r>
+              <w:t xml:space="preserve">(</w:t>
+            </w:r>
+            <w:r>
+              <w:rPr>
+                <w:i/>
+                <w:iCs/>
+              </w:rPr>
+              <w:t xml:space="preserve">AI-Assisted</w:t>
+            </w:r>
+            <w:r>
+              <w:t xml:space="preserve"> </w:t>
+            </w:r>
+            <w:r>
+              <w:t xml:space="preserve">for changes made with Anaplan's AI assistance; blank otherwise)</w:t>
+            </w:r>
+          </w:p>
+        </w:tc>
+      </w:tr>
+      <w:tr>
+        <w:tc>
+          <w:tcPr/>
+          <w:p>
+            <w:pPr>
+              <w:pStyle w:val="Compact"/>
+            </w:pPr>
+            <w:r>
               <w:t xml:space="preserve">captured_at</w:t>
             </w:r>
           </w:p>
@@ -4468,6 +4514,90 @@
         </w:tc>
       </w:tr>
     </w:tbl>
+    <w:p>
+      <w:pPr>
+        <w:pStyle w:val="BodyText"/>
+      </w:pPr>
+      <w:r>
+        <w:t xml:space="preserve">From 4.0.0 the file has a</w:t>
+      </w:r>
+      <w:r>
+        <w:t xml:space="preserve"> </w:t>
+      </w:r>
+      <w:r>
+        <w:rPr>
+          <w:rStyle w:val="VerbatimChar"/>
+        </w:rPr>
+        <w:t xml:space="preserve">method</w:t>
+      </w:r>
+      <w:r>
+        <w:t xml:space="preserve"> </w:t>
+      </w:r>
+      <w:r>
+        <w:t xml:space="preserve">column, taken from the</w:t>
+      </w:r>
+      <w:r>
+        <w:t xml:space="preserve"> </w:t>
+      </w:r>
+      <w:r>
+        <w:rPr>
+          <w:i/>
+          <w:iCs/>
+        </w:rPr>
+        <w:t xml:space="preserve">Method</w:t>
+      </w:r>
+      <w:r>
+        <w:t xml:space="preserve"> </w:t>
+      </w:r>
+      <w:r>
+        <w:t xml:space="preserve">column</w:t>
+      </w:r>
+      <w:r>
+        <w:t xml:space="preserve"> </w:t>
+      </w:r>
+      <w:r>
+        <w:t xml:space="preserve">Anaplan added to the model history export. It is the last column, so</w:t>
+      </w:r>
+      <w:r>
+        <w:t xml:space="preserve"> </w:t>
+      </w:r>
+      <w:r>
+        <w:t xml:space="preserve">existing column-number mappings are unaffected; add a</w:t>
+      </w:r>
+      <w:r>
+        <w:t xml:space="preserve"> </w:t>
+      </w:r>
+      <w:r>
+        <w:rPr>
+          <w:rStyle w:val="VerbatimChar"/>
+        </w:rPr>
+        <w:t xml:space="preserve">method</w:t>
+      </w:r>
+      <w:r>
+        <w:t xml:space="preserve"> </w:t>
+      </w:r>
+      <w:r>
+        <w:t xml:space="preserve">line item and</w:t>
+      </w:r>
+      <w:r>
+        <w:t xml:space="preserve"> </w:t>
+      </w:r>
+      <w:r>
+        <w:t xml:space="preserve">map it to start reporting AI-assisted changes. Changes stored before 4.0.0</w:t>
+      </w:r>
+      <w:r>
+        <w:t xml:space="preserve"> </w:t>
+      </w:r>
+      <w:r>
+        <w:t xml:space="preserve">pick up their method on the next run, as long as Anaplan's export still</w:t>
+      </w:r>
+      <w:r>
+        <w:t xml:space="preserve"> </w:t>
+      </w:r>
+      <w:r>
+        <w:t xml:space="preserve">includes them.</w:t>
+      </w:r>
+    </w:p>
     <w:p>
       <w:pPr>
         <w:pStyle w:val="BodyText"/>

</xml_diff>

<commit_message>
Model History: capture Anaplan's new Method column (AI-assisted changes) (#15)
Anaplan's model history export now carries a Method column ("AI-Assisted"
or blank). It was being logged as unmapped and dropped. Map it to a new
method column on model_history_normalized and MODEL_HISTORY_NORMALIZED.csv,
appended last so existing column-number mappings keep working.

Existing databases gain the column via the usual ADD COLUMN migration.
On re-ingest, method backfills rows stored earlier but is never
overwritten with a blank, since an export may omit the column. record_id
does not include method, so dedup keys are unchanged.

Co-authored-by: Jon Ferneau <jon.ferneau@gmail.com>
Co-authored-by: Claude Opus 5.5 <noreply@anthropic.com>
</commit_message>
<xml_diff>
--- a/docs/anaplan-model-setup-guide.docx
+++ b/docs/anaplan-model-setup-guide.docx
@@ -4448,6 +4448,52 @@
               <w:pStyle w:val="Compact"/>
             </w:pPr>
             <w:r>
+              <w:t xml:space="preserve">method</w:t>
+            </w:r>
+          </w:p>
+        </w:tc>
+        <w:tc>
+          <w:tcPr/>
+          <w:p>
+            <w:pPr>
+              <w:pStyle w:val="Compact"/>
+            </w:pPr>
+            <w:r>
+              <w:rPr>
+                <w:rStyle w:val="VerbatimChar"/>
+              </w:rPr>
+              <w:t xml:space="preserve">method</w:t>
+            </w:r>
+            <w:r>
+              <w:t xml:space="preserve"> </w:t>
+            </w:r>
+            <w:r>
+              <w:t xml:space="preserve">(</w:t>
+            </w:r>
+            <w:r>
+              <w:rPr>
+                <w:i/>
+                <w:iCs/>
+              </w:rPr>
+              <w:t xml:space="preserve">AI-Assisted</w:t>
+            </w:r>
+            <w:r>
+              <w:t xml:space="preserve"> </w:t>
+            </w:r>
+            <w:r>
+              <w:t xml:space="preserve">for changes made with Anaplan's AI assistance; blank otherwise)</w:t>
+            </w:r>
+          </w:p>
+        </w:tc>
+      </w:tr>
+      <w:tr>
+        <w:tc>
+          <w:tcPr/>
+          <w:p>
+            <w:pPr>
+              <w:pStyle w:val="Compact"/>
+            </w:pPr>
+            <w:r>
               <w:t xml:space="preserve">captured_at</w:t>
             </w:r>
           </w:p>
@@ -4468,6 +4514,90 @@
         </w:tc>
       </w:tr>
     </w:tbl>
+    <w:p>
+      <w:pPr>
+        <w:pStyle w:val="BodyText"/>
+      </w:pPr>
+      <w:r>
+        <w:t xml:space="preserve">From 4.0.0 the file has a</w:t>
+      </w:r>
+      <w:r>
+        <w:t xml:space="preserve"> </w:t>
+      </w:r>
+      <w:r>
+        <w:rPr>
+          <w:rStyle w:val="VerbatimChar"/>
+        </w:rPr>
+        <w:t xml:space="preserve">method</w:t>
+      </w:r>
+      <w:r>
+        <w:t xml:space="preserve"> </w:t>
+      </w:r>
+      <w:r>
+        <w:t xml:space="preserve">column, taken from the</w:t>
+      </w:r>
+      <w:r>
+        <w:t xml:space="preserve"> </w:t>
+      </w:r>
+      <w:r>
+        <w:rPr>
+          <w:i/>
+          <w:iCs/>
+        </w:rPr>
+        <w:t xml:space="preserve">Method</w:t>
+      </w:r>
+      <w:r>
+        <w:t xml:space="preserve"> </w:t>
+      </w:r>
+      <w:r>
+        <w:t xml:space="preserve">column</w:t>
+      </w:r>
+      <w:r>
+        <w:t xml:space="preserve"> </w:t>
+      </w:r>
+      <w:r>
+        <w:t xml:space="preserve">Anaplan added to the model history export. It is the last column, so</w:t>
+      </w:r>
+      <w:r>
+        <w:t xml:space="preserve"> </w:t>
+      </w:r>
+      <w:r>
+        <w:t xml:space="preserve">existing column-number mappings are unaffected; add a</w:t>
+      </w:r>
+      <w:r>
+        <w:t xml:space="preserve"> </w:t>
+      </w:r>
+      <w:r>
+        <w:rPr>
+          <w:rStyle w:val="VerbatimChar"/>
+        </w:rPr>
+        <w:t xml:space="preserve">method</w:t>
+      </w:r>
+      <w:r>
+        <w:t xml:space="preserve"> </w:t>
+      </w:r>
+      <w:r>
+        <w:t xml:space="preserve">line item and</w:t>
+      </w:r>
+      <w:r>
+        <w:t xml:space="preserve"> </w:t>
+      </w:r>
+      <w:r>
+        <w:t xml:space="preserve">map it to start reporting AI-assisted changes. Changes stored before 4.0.0</w:t>
+      </w:r>
+      <w:r>
+        <w:t xml:space="preserve"> </w:t>
+      </w:r>
+      <w:r>
+        <w:t xml:space="preserve">pick up their method on the next run, as long as Anaplan's export still</w:t>
+      </w:r>
+      <w:r>
+        <w:t xml:space="preserve"> </w:t>
+      </w:r>
+      <w:r>
+        <w:t xml:space="preserve">includes them.</w:t>
+      </w:r>
+    </w:p>
     <w:p>
       <w:pPr>
         <w:pStyle w:val="BodyText"/>

</xml_diff>